<commit_message>
4e T1 : TP 2 (003 et 003_C), titre « Travail Pratique (TP II) »
Co-Authored-By: Claude Opus 5.5 <noreply@anthropic.com>
Claude-Session: https://claude.ai/code/session_01MXbzGDRQSvh31KmCSLURJ6
</commit_message>
<xml_diff>
--- a/docs/local/DOCX/4eT1/003.docx
+++ b/docs/local/DOCX/4eT1/003.docx
@@ -21,9 +21,11 @@
         <w:tc>
           <w:tcPr>
             <w:tcW w:w="3397" w:type="dxa"/>
+            <w:vAlign w:val="center"/>
           </w:tcPr>
           <w:p>
             <w:pPr>
+              <w:spacing w:before="0" w:after="0"/>
               <w:jc w:val="center"/>
               <w:rPr>
                 <w:rFonts w:ascii="Aptos" w:hAnsi="Aptos"/>
@@ -36,17 +38,9 @@
                 <w:color w:val="000000" w:themeColor="text1"/>
               </w:rPr>
               <w:drawing>
-                <wp:anchor distT="0" distB="0" distL="114300" distR="114300" simplePos="0" relativeHeight="251669504" behindDoc="0" locked="0" layoutInCell="1" allowOverlap="1" wp14:anchorId="334AD4FE" wp14:editId="58D9D23D">
-                  <wp:simplePos x="0" y="0"/>
-                  <wp:positionH relativeFrom="column">
-                    <wp:posOffset>207645</wp:posOffset>
-                  </wp:positionH>
-                  <wp:positionV relativeFrom="margin">
-                    <wp:posOffset>63293</wp:posOffset>
-                  </wp:positionV>
+                <wp:inline distT="0" distB="0" distL="0" distR="0">
                   <wp:extent cx="1606550" cy="842645"/>
                   <wp:effectExtent l="0" t="0" r="6350" b="0"/>
-                  <wp:wrapSquare wrapText="bothSides"/>
                   <wp:docPr id="905082273" name="Image 1"/>
                   <wp:cNvGraphicFramePr>
                     <a:graphicFrameLocks xmlns:a="http://schemas.openxmlformats.org/drawingml/2006/main" noChangeAspect="1"/>
@@ -89,24 +83,31 @@
                       </pic:pic>
                     </a:graphicData>
                   </a:graphic>
-                  <wp14:sizeRelH relativeFrom="margin">
-                    <wp14:pctWidth>0</wp14:pctWidth>
-                  </wp14:sizeRelH>
-                  <wp14:sizeRelV relativeFrom="margin">
-                    <wp14:pctHeight>0</wp14:pctHeight>
-                  </wp14:sizeRelV>
-                </wp:anchor>
+                </wp:inline>
               </w:drawing>
             </w:r>
+          </w:p>
+          <w:p>
+            <w:pPr>
+              <w:spacing w:before="0" w:after="0"/>
+              <w:jc w:val="center"/>
+              <w:rPr>
+                <w:rFonts w:ascii="Aptos" w:hAnsi="Aptos"/>
+              </w:rPr>
+            </w:pPr>
             <w:r>
               <w:rPr>
                 <w:rFonts w:ascii="Aptos" w:hAnsi="Aptos"/>
+                <w:sz w:val="20"/>
+                <w:szCs w:val="20"/>
               </w:rPr>
               <w:t>1</w:t>
             </w:r>
             <w:r>
               <w:rPr>
                 <w:rFonts w:ascii="Aptos" w:hAnsi="Aptos"/>
+                <w:sz w:val="20"/>
+                <w:szCs w:val="20"/>
                 <w:vertAlign w:val="superscript"/>
               </w:rPr>
               <w:t>er</w:t>
@@ -114,18 +115,24 @@
             <w:r>
               <w:rPr>
                 <w:rFonts w:ascii="Aptos" w:hAnsi="Aptos"/>
+                <w:sz w:val="20"/>
+                <w:szCs w:val="20"/>
               </w:rPr>
               <w:t xml:space="preserve"> Trimestre | 2026 – 2027 | </w:t>
             </w:r>
             <w:r>
               <w:rPr>
                 <w:rFonts w:ascii="Aptos" w:hAnsi="Aptos"/>
+                <w:sz w:val="20"/>
+                <w:szCs w:val="20"/>
               </w:rPr>
               <w:t>4</w:t>
             </w:r>
             <w:r>
               <w:rPr>
                 <w:rFonts w:ascii="Aptos" w:hAnsi="Aptos"/>
+                <w:sz w:val="20"/>
+                <w:szCs w:val="20"/>
                 <w:vertAlign w:val="superscript"/>
               </w:rPr>
               <w:t>e</w:t>
@@ -328,28 +335,7 @@
           <w:sz w:val="28"/>
           <w:szCs w:val="28"/>
         </w:rPr>
-        <w:t>Travail Pratique II (</w:t>
-      </w:r>
-      <m:oMath>
-        <m:r>
-          <m:rPr>
-            <m:nor/>
-          </m:rPr>
-          <w:rPr>
-            <w:rFonts w:ascii="Cambria Math" w:hAnsi="Cambria Math"/>
-            <w:sz w:val="28"/>
-            <w:szCs w:val="28"/>
-          </w:rPr>
-          <m:t>TP 2</m:t>
-        </m:r>
-      </m:oMath>
-      <w:r>
-        <w:rPr>
-          <w:rFonts w:ascii="Aptos" w:hAnsi="Aptos"/>
-          <w:sz w:val="28"/>
-          <w:szCs w:val="28"/>
-        </w:rPr>
-        <w:t>)</w:t>
+        <w:t xml:space="preserve">Travail Pratique (TP II)</w:t>
       </w:r>
     </w:p>
     <w:p>

</xml_diff>